<commit_message>
Kisebb javítások, Befizetés arányának megcsinálása
</commit_message>
<xml_diff>
--- a/Kercsó Norbert, Pallai Norbert Zoltán.docx
+++ b/Kercsó Norbert, Pallai Norbert Zoltán.docx
@@ -984,9 +984,9 @@
       </w:tblPr>
       <w:tblGrid>
         <w:gridCol w:w="1414"/>
-        <w:gridCol w:w="1575"/>
-        <w:gridCol w:w="1972"/>
-        <w:gridCol w:w="2835"/>
+        <w:gridCol w:w="1679"/>
+        <w:gridCol w:w="1922"/>
+        <w:gridCol w:w="2781"/>
       </w:tblGrid>
       <w:tr>
         <w:tc>
@@ -1363,7 +1363,13 @@
               <w:rPr>
                 <w:rFonts w:cs="Calibri"/>
               </w:rPr>
-              <w:t>255)</w:t>
+              <w:t>MAX</w:t>
+            </w:r>
+            <w:r>
+              <w:rPr>
+                <w:rFonts w:cs="Calibri"/>
+              </w:rPr>
+              <w:t>)</w:t>
             </w:r>
           </w:p>
         </w:tc>
@@ -3576,74 +3582,6 @@
             </w:pPr>
             <w:proofErr w:type="spellStart"/>
             <w:r>
-              <w:t>KarbantartoID</w:t>
-            </w:r>
-            <w:proofErr w:type="spellEnd"/>
-          </w:p>
-        </w:tc>
-        <w:tc>
-          <w:tcPr>
-            <w:tcW w:w="1619" w:type="dxa"/>
-            <w:vAlign w:val="center"/>
-          </w:tcPr>
-          <w:p>
-            <w:pPr>
-              <w:ind w:left="0"/>
-            </w:pPr>
-            <w:r>
-              <w:t>int</w:t>
-            </w:r>
-          </w:p>
-        </w:tc>
-        <w:tc>
-          <w:tcPr>
-            <w:tcW w:w="1665" w:type="dxa"/>
-            <w:vAlign w:val="center"/>
-          </w:tcPr>
-          <w:p>
-            <w:pPr>
-              <w:ind w:left="0"/>
-            </w:pPr>
-            <w:r>
-              <w:t>FK</w:t>
-            </w:r>
-            <w:r>
-              <w:t xml:space="preserve">, </w:t>
-            </w:r>
-            <w:proofErr w:type="spellStart"/>
-            <w:r>
-              <w:t>Nullable</w:t>
-            </w:r>
-            <w:proofErr w:type="spellEnd"/>
-          </w:p>
-        </w:tc>
-        <w:tc>
-          <w:tcPr>
-            <w:tcW w:w="2414" w:type="dxa"/>
-            <w:vAlign w:val="center"/>
-          </w:tcPr>
-          <w:p>
-            <w:pPr>
-              <w:ind w:left="0"/>
-            </w:pPr>
-            <w:r>
-              <w:t>A javítást végző személy.</w:t>
-            </w:r>
-          </w:p>
-        </w:tc>
-      </w:tr>
-      <w:tr>
-        <w:tc>
-          <w:tcPr>
-            <w:tcW w:w="2098" w:type="dxa"/>
-            <w:vAlign w:val="center"/>
-          </w:tcPr>
-          <w:p>
-            <w:pPr>
-              <w:ind w:left="0"/>
-            </w:pPr>
-            <w:proofErr w:type="spellStart"/>
-            <w:r>
               <w:t>Leiras</w:t>
             </w:r>
             <w:proofErr w:type="spellEnd"/>
@@ -4020,6 +3958,174 @@
             </w:pPr>
             <w:r>
               <w:t>Státusz neve (pl. Új, Kész).</w:t>
+            </w:r>
+          </w:p>
+        </w:tc>
+      </w:tr>
+    </w:tbl>
+    <w:p>
+      <w:pPr>
+        <w:pStyle w:val="Cmsor3"/>
+      </w:pPr>
+      <w:r>
+        <w:t xml:space="preserve"> </w:t>
+      </w:r>
+      <w:proofErr w:type="spellStart"/>
+      <w:r>
+        <w:t>Kollegium</w:t>
+      </w:r>
+      <w:proofErr w:type="spellEnd"/>
+    </w:p>
+    <w:tbl>
+      <w:tblPr>
+        <w:tblStyle w:val="Rcsostblzat"/>
+        <w:tblW w:w="7796" w:type="dxa"/>
+        <w:tblInd w:w="704" w:type="dxa"/>
+        <w:tblLook w:val="04A0" w:firstRow="1" w:lastRow="0" w:firstColumn="1" w:lastColumn="0" w:noHBand="0" w:noVBand="1"/>
+      </w:tblPr>
+      <w:tblGrid>
+        <w:gridCol w:w="2098"/>
+        <w:gridCol w:w="1619"/>
+        <w:gridCol w:w="1665"/>
+        <w:gridCol w:w="2414"/>
+      </w:tblGrid>
+      <w:tr>
+        <w:tc>
+          <w:tcPr>
+            <w:tcW w:w="2098" w:type="dxa"/>
+            <w:vAlign w:val="center"/>
+          </w:tcPr>
+          <w:p>
+            <w:pPr>
+              <w:ind w:left="0"/>
+            </w:pPr>
+            <w:r>
+              <w:t>ID</w:t>
+            </w:r>
+          </w:p>
+        </w:tc>
+        <w:tc>
+          <w:tcPr>
+            <w:tcW w:w="1619" w:type="dxa"/>
+            <w:vAlign w:val="center"/>
+          </w:tcPr>
+          <w:p>
+            <w:pPr>
+              <w:ind w:left="0"/>
+            </w:pPr>
+            <w:r>
+              <w:t>int</w:t>
+            </w:r>
+          </w:p>
+        </w:tc>
+        <w:tc>
+          <w:tcPr>
+            <w:tcW w:w="1665" w:type="dxa"/>
+            <w:vAlign w:val="center"/>
+          </w:tcPr>
+          <w:p>
+            <w:pPr>
+              <w:ind w:left="0"/>
+            </w:pPr>
+            <w:r>
+              <w:t xml:space="preserve">PK, </w:t>
+            </w:r>
+            <w:proofErr w:type="spellStart"/>
+            <w:r>
+              <w:t>Identity</w:t>
+            </w:r>
+            <w:proofErr w:type="spellEnd"/>
+          </w:p>
+        </w:tc>
+        <w:tc>
+          <w:tcPr>
+            <w:tcW w:w="2414" w:type="dxa"/>
+            <w:vAlign w:val="center"/>
+          </w:tcPr>
+          <w:p>
+            <w:pPr>
+              <w:ind w:left="0"/>
+            </w:pPr>
+            <w:r>
+              <w:t>Azonosító</w:t>
+            </w:r>
+          </w:p>
+        </w:tc>
+      </w:tr>
+      <w:tr>
+        <w:tc>
+          <w:tcPr>
+            <w:tcW w:w="2098" w:type="dxa"/>
+            <w:vAlign w:val="center"/>
+          </w:tcPr>
+          <w:p>
+            <w:pPr>
+              <w:ind w:left="0"/>
+            </w:pPr>
+            <w:proofErr w:type="spellStart"/>
+            <w:r>
+              <w:t>KollegiumNev</w:t>
+            </w:r>
+            <w:proofErr w:type="spellEnd"/>
+          </w:p>
+        </w:tc>
+        <w:tc>
+          <w:tcPr>
+            <w:tcW w:w="1619" w:type="dxa"/>
+            <w:vAlign w:val="center"/>
+          </w:tcPr>
+          <w:p>
+            <w:pPr>
+              <w:ind w:left="0"/>
+            </w:pPr>
+            <w:proofErr w:type="spellStart"/>
+            <w:proofErr w:type="gramStart"/>
+            <w:r>
+              <w:t>nvarchar</w:t>
+            </w:r>
+            <w:proofErr w:type="spellEnd"/>
+            <w:r>
+              <w:t>(</w:t>
+            </w:r>
+            <w:proofErr w:type="gramEnd"/>
+            <w:r>
+              <w:t>50)</w:t>
+            </w:r>
+          </w:p>
+        </w:tc>
+        <w:tc>
+          <w:tcPr>
+            <w:tcW w:w="1665" w:type="dxa"/>
+            <w:vAlign w:val="center"/>
+          </w:tcPr>
+          <w:p>
+            <w:pPr>
+              <w:ind w:left="0"/>
+            </w:pPr>
+            <w:proofErr w:type="spellStart"/>
+            <w:r>
+              <w:t>Not</w:t>
+            </w:r>
+            <w:proofErr w:type="spellEnd"/>
+            <w:r>
+              <w:t xml:space="preserve"> </w:t>
+            </w:r>
+            <w:r>
+              <w:t>Null</w:t>
+            </w:r>
+          </w:p>
+        </w:tc>
+        <w:tc>
+          <w:tcPr>
+            <w:tcW w:w="2414" w:type="dxa"/>
+            <w:vAlign w:val="center"/>
+          </w:tcPr>
+          <w:p>
+            <w:pPr>
+              <w:ind w:left="0"/>
+            </w:pPr>
+            <w:r>
+              <w:t>Kollégium neve</w:t>
             </w:r>
           </w:p>
         </w:tc>
@@ -11594,7 +11700,7 @@
   <w:style w:type="paragraph" w:default="1" w:styleId="Norml">
     <w:name w:val="Normal"/>
     <w:qFormat/>
-    <w:rsid w:val="00BA60D9"/>
+    <w:rsid w:val="00012D8E"/>
     <w:pPr>
       <w:spacing w:line="360" w:lineRule="auto"/>
       <w:ind w:left="851"/>

</xml_diff>